<commit_message>
fix(template): rebuild filing_commitment template.docx with new field placeholders (承诺书模板重建)
Old placeholders (commitment_content, applicant_name, applicant_signature) replaced
with new schema fields (project_name, sponsor, estimated_time, location, etc.).
Full commitment letter text with 4 legal declarations, US Letter, Arial 12pt.
</commit_message>
<xml_diff>
--- a/app/templates/filing_commitment/template.docx
+++ b/app/templates/filing_commitment/template.docx
@@ -1,39 +1,351 @@
 
 <file path=word/document.xml><?xml version="1.0" encoding="utf-8"?>
-<w:document xmlns:wpc="http://schemas.microsoft.com/office/word/2010/wordprocessingCanvas" xmlns:mo="http://schemas.microsoft.com/office/mac/office/2008/main" xmlns:mc="http://schemas.openxmlformats.org/markup-compatibility/2006" xmlns:mv="urn:schemas-microsoft-com:mac:vml" xmlns:o="urn:schemas-microsoft-com:office:office" xmlns:r="http://schemas.openxmlformats.org/officeDocument/2006/relationships" xmlns:m="http://schemas.openxmlformats.org/officeDocument/2006/math" xmlns:v="urn:schemas-microsoft-com:vml" xmlns:wp14="http://schemas.microsoft.com/office/word/2010/wordprocessingDrawing" xmlns:wp="http://schemas.openxmlformats.org/drawingml/2006/wordprocessingDrawing" xmlns:w10="urn:schemas-microsoft-com:office:word" xmlns:w="http://schemas.openxmlformats.org/wordprocessingml/2006/main" xmlns:w14="http://schemas.microsoft.com/office/word/2010/wordml" xmlns:wpg="http://schemas.microsoft.com/office/word/2010/wordprocessingGroup" xmlns:wpi="http://schemas.microsoft.com/office/word/2010/wordprocessingInk" xmlns:wne="http://schemas.microsoft.com/office/word/2006/wordml" xmlns:wps="http://schemas.microsoft.com/office/word/2010/wordprocessingShape" mc:Ignorable="w14 wp14">
+<w:document xmlns:wpc="http://schemas.microsoft.com/office/word/2010/wordprocessingCanvas" xmlns:mc="http://schemas.openxmlformats.org/markup-compatibility/2006" xmlns:o="urn:schemas-microsoft-com:office:office" xmlns:r="http://schemas.openxmlformats.org/officeDocument/2006/relationships" xmlns:m="http://schemas.openxmlformats.org/officeDocument/2006/math" xmlns:v="urn:schemas-microsoft-com:vml" xmlns:wp="http://schemas.openxmlformats.org/drawingml/2006/wordprocessingDrawing" xmlns:w10="urn:schemas-microsoft-com:office:word" xmlns:w="http://schemas.openxmlformats.org/wordprocessingml/2006/main" xmlns:wne="http://schemas.microsoft.com/office/word/2006/wordml" mc:Ignorable="w14 wp14">
   <w:body>
+    <!-- Title -->
     <w:p>
       <w:pPr>
-        <w:pStyle w:val="Title"/>
+        <w:jc w:val="center"/>
+        <w:spacing w:after="360"/>
       </w:pPr>
       <w:r>
-        <w:t>备案承诺书</w:t>
+        <w:rPr>
+          <w:b/>
+          <w:sz w:val="32"/>
+          <w:rFonts w:ascii="Arial" w:hAnsi="Arial"/>
+        </w:rPr>
+        <w:t xml:space="preserve">活动备案承诺书</w:t>
       </w:r>
     </w:p>
     <w:p>
+      <w:pPr>
+        <w:spacing w:after="120"/>
+      </w:pPr>
+    </w:p>
+    <!-- 致 -->
+    <w:p>
+      <w:pPr>
+        <w:spacing w:after="120"/>
+      </w:pPr>
       <w:r>
-        <w:t>{{ commitment_content }}</w:t>
-      </w:r>
-    </w:p>
-    <w:p/>
-    <w:p>
-      <w:r>
-        <w:t>申请人：{{ applicant_name }}</w:t>
+        <w:rPr>
+          <w:sz w:val="24"/>
+          <w:rFonts w:ascii="Arial" w:hAnsi="Arial"/>
+        </w:rPr>
+        <w:t>致天津市公安局：</w:t>
       </w:r>
     </w:p>
     <w:p>
+      <w:pPr>
+        <w:spacing w:after="120"/>
+      </w:pPr>
+    </w:p>
+    <!-- Body -->
+    <w:p>
+      <w:pPr>
+        <w:spacing w:after="120"/>
+      </w:pPr>
       <w:r>
-        <w:t>申请人签字：{{ applicant_signature }}</w:t>
+        <w:rPr>
+          <w:sz w:val="24"/>
+          <w:rFonts w:ascii="Arial" w:hAnsi="Arial"/>
+        </w:rPr>
+        <w:t xml:space="preserve">我单位（</w:t>
+      </w:r>
+      <w:r>
+        <w:rPr>
+          <w:sz w:val="24"/>
+          <w:rFonts w:ascii="Arial" w:hAnsi="Arial"/>
+        </w:rPr>
+        <w:t>{{ sponsor }}</w:t>
+      </w:r>
+      <w:r>
+        <w:rPr>
+          <w:sz w:val="24"/>
+          <w:rFonts w:ascii="Arial" w:hAnsi="Arial"/>
+        </w:rPr>
+        <w:t xml:space="preserve">）定于</w:t>
+      </w:r>
+      <w:r>
+        <w:rPr>
+          <w:sz w:val="24"/>
+          <w:rFonts w:ascii="Arial" w:hAnsi="Arial"/>
+        </w:rPr>
+        <w:t>{{ estimated_time }}</w:t>
+      </w:r>
+      <w:r>
+        <w:rPr>
+          <w:sz w:val="24"/>
+          <w:rFonts w:ascii="Arial" w:hAnsi="Arial"/>
+        </w:rPr>
+        <w:t xml:space="preserve">，在</w:t>
+      </w:r>
+      <w:r>
+        <w:rPr>
+          <w:sz w:val="24"/>
+          <w:rFonts w:ascii="Arial" w:hAnsi="Arial"/>
+        </w:rPr>
+        <w:t>{{ location }}</w:t>
+      </w:r>
+      <w:r>
+        <w:rPr>
+          <w:sz w:val="24"/>
+          <w:rFonts w:ascii="Arial" w:hAnsi="Arial"/>
+        </w:rPr>
+        <w:t xml:space="preserve">举办“</w:t>
+      </w:r>
+      <w:r>
+        <w:rPr>
+          <w:sz w:val="24"/>
+          <w:rFonts w:ascii="Arial" w:hAnsi="Arial"/>
+        </w:rPr>
+        <w:t>{{ project_name }}</w:t>
+      </w:r>
+      <w:r>
+        <w:rPr>
+          <w:sz w:val="24"/>
+          <w:rFonts w:ascii="Arial" w:hAnsi="Arial"/>
+        </w:rPr>
+        <w:t xml:space="preserve">”活动。</w:t>
+      </w:r>
+    </w:p>
+    <!-- Activity type -->
+    <w:p>
+      <w:pPr>
+        <w:spacing w:after="120"/>
+      </w:pPr>
+      <w:r>
+        <w:rPr>
+          <w:sz w:val="24"/>
+          <w:rFonts w:ascii="Arial" w:hAnsi="Arial"/>
+        </w:rPr>
+        <w:t xml:space="preserve">活动类型：</w:t>
+      </w:r>
+      <w:r>
+        <w:rPr>
+          <w:sz w:val="24"/>
+          <w:rFonts w:ascii="Arial" w:hAnsi="Arial"/>
+        </w:rPr>
+        <w:t>{{ activity_type }}</w:t>
+      </w:r>
+    </w:p>
+    <!-- Crowd scale -->
+    <w:p>
+      <w:pPr>
+        <w:spacing w:after="120"/>
+      </w:pPr>
+      <w:r>
+        <w:rPr>
+          <w:sz w:val="24"/>
+          <w:rFonts w:ascii="Arial" w:hAnsi="Arial"/>
+        </w:rPr>
+        <w:t xml:space="preserve">预计参加人数：</w:t>
+      </w:r>
+      <w:r>
+        <w:rPr>
+          <w:sz w:val="24"/>
+          <w:rFonts w:ascii="Arial" w:hAnsi="Arial"/>
+        </w:rPr>
+        <w:t>{{ crowd_scale }}</w:t>
+      </w:r>
+    </w:p>
+    <!-- Security staff -->
+    <w:p>
+      <w:pPr>
+        <w:spacing w:after="120"/>
+      </w:pPr>
+      <w:r>
+        <w:rPr>
+          <w:sz w:val="24"/>
+          <w:rFonts w:ascii="Arial" w:hAnsi="Arial"/>
+        </w:rPr>
+        <w:t xml:space="preserve">安保人员配置：</w:t>
+      </w:r>
+      <w:r>
+        <w:rPr>
+          <w:sz w:val="24"/>
+          <w:rFonts w:ascii="Arial" w:hAnsi="Arial"/>
+        </w:rPr>
+        <w:t>{{ security_staff_count }}</w:t>
+      </w:r>
+      <w:r>
+        <w:rPr>
+          <w:sz w:val="24"/>
+          <w:rFonts w:ascii="Arial" w:hAnsi="Arial"/>
+        </w:rPr>
+        <w:t>人</w:t>
       </w:r>
     </w:p>
     <w:p>
+      <w:pPr>
+        <w:spacing w:after="120"/>
+      </w:pPr>
+    </w:p>
+    <!-- 承诺 -->
+    <w:p>
+      <w:pPr>
+        <w:spacing w:after="120"/>
+      </w:pPr>
       <w:r>
-        <w:t>备案日期：{{ filing_date }}</w:t>
+        <w:rPr>
+          <w:sz w:val="24"/>
+          <w:rFonts w:ascii="Arial" w:hAnsi="Arial"/>
+        </w:rPr>
+        <w:t>我单位郑重承诺：</w:t>
+      </w:r>
+    </w:p>
+    <w:p>
+      <w:pPr>
+        <w:spacing w:after="80"/>
+      </w:pPr>
+      <w:r>
+        <w:rPr>
+          <w:sz w:val="24"/>
+          <w:rFonts w:ascii="Arial" w:hAnsi="Arial"/>
+        </w:rPr>
+        <w:t>一、所提交的活动方案、安保方案、风险评估报备表、安全消防责任确认书等备案材料真实、完整、有效；</w:t>
+      </w:r>
+    </w:p>
+    <w:p>
+      <w:pPr>
+        <w:spacing w:after="80"/>
+      </w:pPr>
+      <w:r>
+        <w:rPr>
+          <w:sz w:val="24"/>
+          <w:rFonts w:ascii="Arial" w:hAnsi="Arial"/>
+        </w:rPr>
+        <w:t>二、严格遵守《大型群众性活动安全管理条例》及相关法律法规，落实安全主体责任；</w:t>
+      </w:r>
+    </w:p>
+    <w:p>
+      <w:pPr>
+        <w:spacing w:after="80"/>
+      </w:pPr>
+      <w:r>
+        <w:rPr>
+          <w:sz w:val="24"/>
+          <w:rFonts w:ascii="Arial" w:hAnsi="Arial"/>
+        </w:rPr>
+        <w:t>三、按照批准的安保方案组织实施，确保活动安全有序进行；</w:t>
+      </w:r>
+    </w:p>
+    <w:p>
+      <w:pPr>
+        <w:spacing w:after="120"/>
+      </w:pPr>
+      <w:r>
+        <w:rPr>
+          <w:sz w:val="24"/>
+          <w:rFonts w:ascii="Arial" w:hAnsi="Arial"/>
+        </w:rPr>
+        <w:t>四、如活动时间、地点、规模等发生变更，及时向公安机关重新报备。</w:t>
+      </w:r>
+    </w:p>
+    <w:p>
+      <w:pPr>
+        <w:spacing w:after="120"/>
+      </w:pPr>
+    </w:p>
+    <!-- 法律责任 -->
+    <w:p>
+      <w:pPr>
+        <w:spacing w:after="120"/>
+      </w:pPr>
+      <w:r>
+        <w:rPr>
+          <w:sz w:val="24"/>
+          <w:rFonts w:ascii="Arial" w:hAnsi="Arial"/>
+        </w:rPr>
+        <w:t>以上承诺如有虚假，我单位愿承担相应法律责任。</w:t>
+      </w:r>
+    </w:p>
+    <w:p>
+      <w:pPr>
+        <w:spacing w:after="120"/>
+      </w:pPr>
+    </w:p>
+    <!-- 特此承诺 -->
+    <w:p>
+      <w:pPr>
+        <w:spacing w:after="240"/>
+      </w:pPr>
+      <w:r>
+        <w:rPr>
+          <w:sz w:val="24"/>
+          <w:rFonts w:ascii="Arial" w:hAnsi="Arial"/>
+        </w:rPr>
+        <w:t>特此承诺</w:t>
+      </w:r>
+    </w:p>
+    <w:p>
+      <w:pPr>
+        <w:spacing w:after="240"/>
+      </w:pPr>
+    </w:p>
+    <!-- 承诺单位 -->
+    <w:p>
+      <w:pPr>
+        <w:spacing w:after="120"/>
+      </w:pPr>
+      <w:r>
+        <w:rPr>
+          <w:sz w:val="24"/>
+          <w:rFonts w:ascii="Arial" w:hAnsi="Arial"/>
+        </w:rPr>
+        <w:t xml:space="preserve">承诺单位（盖章）：</w:t>
+      </w:r>
+      <w:r>
+        <w:rPr>
+          <w:sz w:val="24"/>
+          <w:rFonts w:ascii="Arial" w:hAnsi="Arial"/>
+        </w:rPr>
+        <w:t>{{ sponsor }}</w:t>
+      </w:r>
+    </w:p>
+    <!-- 签字 -->
+    <w:p>
+      <w:pPr>
+        <w:spacing w:after="120"/>
+      </w:pPr>
+      <w:r>
+        <w:rPr>
+          <w:sz w:val="24"/>
+          <w:rFonts w:ascii="Arial" w:hAnsi="Arial"/>
+        </w:rPr>
+        <w:t xml:space="preserve">安全负责人签字：</w:t>
+      </w:r>
+      <w:r>
+        <w:rPr>
+          <w:sz w:val="24"/>
+          <w:rFonts w:ascii="Arial" w:hAnsi="Arial"/>
+        </w:rPr>
+        <w:t>{{ manager_signature }}</w:t>
+      </w:r>
+    </w:p>
+    <!-- 日期 -->
+    <w:p>
+      <w:pPr>
+        <w:spacing w:after="120"/>
+      </w:pPr>
+      <w:r>
+        <w:rPr>
+          <w:sz w:val="24"/>
+          <w:rFonts w:ascii="Arial" w:hAnsi="Arial"/>
+        </w:rPr>
+        <w:t xml:space="preserve">日期：</w:t>
+      </w:r>
+      <w:r>
+        <w:rPr>
+          <w:sz w:val="24"/>
+          <w:rFonts w:ascii="Arial" w:hAnsi="Arial"/>
+        </w:rPr>
+        <w:t>{{ filing_date }}</w:t>
       </w:r>
     </w:p>
     <w:sectPr>
       <w:pgSz w:w="12240" w:h="15840"/>
-      <w:pgMar w:top="1440" w:right="1800" w:bottom="1440" w:left="1800" w:header="720" w:footer="720" w:gutter="0"/>
+      <w:pgMar w:top="1440" w:right="1440" w:bottom="1440" w:left="1440" w:header="720" w:footer="720" w:gutter="0"/>
       <w:cols w:space="720"/>
       <w:docGrid w:linePitch="360"/>
     </w:sectPr>

</xml_diff>